<commit_message>
updated uploadattendance and submitforapproval ui
</commit_message>
<xml_diff>
--- a/eaas_python/template_files/DTR_AS_template.docx
+++ b/eaas_python/template_files/DTR_AS_template.docx
@@ -1207,7 +1207,7 @@
       </w:tr>
       <w:tr>
         <w:trPr>
-          <w:trHeight w:val="855"/>
+          <w:trHeight w:val="546"/>
         </w:trPr>
         <w:tc>
           <w:tcPr>
@@ -1253,24 +1253,6 @@
               </w:rPr>
               <w:t>APPROVED BY:</w:t>
             </w:r>
-          </w:p>
-          <w:p>
-            <w:pPr>
-              <w:rPr>
-                <w:rFonts w:ascii="Arial" w:eastAsia="Arial" w:hAnsi="Arial" w:cs="Arial"/>
-                <w:sz w:val="18"/>
-                <w:szCs w:val="18"/>
-              </w:rPr>
-            </w:pPr>
-          </w:p>
-          <w:p>
-            <w:pPr>
-              <w:rPr>
-                <w:rFonts w:ascii="Arial" w:eastAsia="Arial" w:hAnsi="Arial" w:cs="Arial"/>
-                <w:sz w:val="18"/>
-                <w:szCs w:val="18"/>
-              </w:rPr>
-            </w:pPr>
           </w:p>
         </w:tc>
       </w:tr>

</xml_diff>

<commit_message>
updated dtr as template
</commit_message>
<xml_diff>
--- a/eaas_python/template_files/DTR_AS_template.docx
+++ b/eaas_python/template_files/DTR_AS_template.docx
@@ -16,10 +16,17 @@
         </w:rPr>
       </w:pPr>
     </w:p>
+    <w:p>
+      <w:pPr>
+        <w:rPr>
+          <w:rFonts w:ascii="Arial" w:eastAsia="Arial" w:hAnsi="Arial" w:cs="Arial"/>
+        </w:rPr>
+      </w:pPr>
+    </w:p>
     <w:tbl>
       <w:tblPr>
         <w:tblStyle w:val="a"/>
-        <w:tblpPr w:leftFromText="180" w:rightFromText="180" w:vertAnchor="page" w:horzAnchor="page" w:tblpX="1926" w:tblpY="621"/>
+        <w:tblpPr w:leftFromText="180" w:rightFromText="180" w:vertAnchor="page" w:horzAnchor="margin" w:tblpXSpec="center" w:tblpY="1321"/>
         <w:tblW w:w="8535" w:type="dxa"/>
         <w:tblBorders>
           <w:top w:val="single" w:sz="4" w:space="0" w:color="000000"/>
@@ -64,7 +71,7 @@
                 <w:noProof/>
               </w:rPr>
               <w:drawing>
-                <wp:anchor distT="0" distB="0" distL="114300" distR="114300" simplePos="0" relativeHeight="251681792" behindDoc="0" locked="0" layoutInCell="1" allowOverlap="1" wp14:anchorId="71B98792" wp14:editId="7C4A8D9A">
+                <wp:anchor distT="0" distB="0" distL="114300" distR="114300" simplePos="0" relativeHeight="251659264" behindDoc="0" locked="0" layoutInCell="1" allowOverlap="1" wp14:anchorId="4A4A4A4C" wp14:editId="1F1120B9">
                   <wp:simplePos x="0" y="0"/>
                   <wp:positionH relativeFrom="column">
                     <wp:posOffset>947420</wp:posOffset>
@@ -164,15 +171,6 @@
           </w:p>
           <w:p>
             <w:pPr>
-              <w:jc w:val="center"/>
-              <w:rPr>
-                <w:rFonts w:ascii="Arial" w:eastAsia="Arial" w:hAnsi="Arial" w:cs="Arial"/>
-              </w:rPr>
-            </w:pPr>
-          </w:p>
-          <w:p>
-            <w:pPr>
-              <w:jc w:val="center"/>
               <w:rPr>
                 <w:rFonts w:ascii="Arial" w:eastAsia="Arial" w:hAnsi="Arial" w:cs="Arial"/>
                 <w:b/>
@@ -249,13 +247,6 @@
               </w:rPr>
               <w:t xml:space="preserve">DAILY TIME RECORD (DTR) ADJUSTMENT SLIP </w:t>
             </w:r>
-          </w:p>
-          <w:p>
-            <w:pPr>
-              <w:rPr>
-                <w:rFonts w:ascii="Arial" w:eastAsia="Arial" w:hAnsi="Arial" w:cs="Arial"/>
-              </w:rPr>
-            </w:pPr>
           </w:p>
         </w:tc>
       </w:tr>
@@ -1358,13 +1349,6 @@
         </w:tc>
       </w:tr>
     </w:tbl>
-    <w:p>
-      <w:pPr>
-        <w:rPr>
-          <w:rFonts w:ascii="Arial" w:eastAsia="Arial" w:hAnsi="Arial" w:cs="Arial"/>
-        </w:rPr>
-      </w:pPr>
-    </w:p>
     <w:p>
       <w:pPr>
         <w:rPr>

</xml_diff>